<commit_message>
Keep only the Word document, and fix its font falling back to a serif
STYLE.md is removed — one readable file, not two.

The first build set Calibri's replacement, Aptos, as the body face. Aptos
ships only with very recent Office builds; where it is missing Word
substitutes silently, and it picks a SERIF — opening the document showed the
whole thing set in Times, which is not what it was designed as. Calibri ships
with every Office version still in use.

Verified by opening it in Word through COM rather than by inspecting the zip:
it reports 10 pages and 1152 words, exports to PDF, and the rendered pages
show the sans body, the shaded table headers, the accent rules under each
heading and Consolas on every token name.

Co-Authored-By: Claude Opus 5 (1M context) <noreply@anthropic.com>
</commit_message>
<xml_diff>
--- a/Style-Reference.docx
+++ b/Style-Reference.docx
@@ -8,7 +8,7 @@
       </w:pPr>
       <w:r>
         <w:rPr>
-          <w:rFonts w:ascii="Aptos" w:cs="Aptos" w:eastAsia="Aptos" w:hAnsi="Aptos"/>
+          <w:rFonts w:ascii="Calibri" w:cs="Calibri" w:eastAsia="Calibri" w:hAnsi="Calibri"/>
           <w:b/>
           <w:bCs/>
           <w:color w:val="0B5ED1"/>
@@ -24,7 +24,7 @@
       </w:pPr>
       <w:r>
         <w:rPr>
-          <w:rFonts w:ascii="Aptos" w:cs="Aptos" w:eastAsia="Aptos" w:hAnsi="Aptos"/>
+          <w:rFonts w:ascii="Calibri" w:cs="Calibri" w:eastAsia="Calibri" w:hAnsi="Calibri"/>
           <w:b/>
           <w:bCs/>
           <w:color w:val="393A3D"/>
@@ -40,7 +40,7 @@
       </w:pPr>
       <w:r>
         <w:rPr>
-          <w:rFonts w:ascii="Aptos" w:cs="Aptos" w:eastAsia="Aptos" w:hAnsi="Aptos"/>
+          <w:rFonts w:ascii="Calibri" w:cs="Calibri" w:eastAsia="Calibri" w:hAnsi="Calibri"/>
           <w:color w:val="55585E"/>
           <w:sz w:val="21"/>
           <w:szCs w:val="21"/>
@@ -58,7 +58,7 @@
       </w:r>
       <w:r>
         <w:rPr>
-          <w:rFonts w:ascii="Aptos" w:cs="Aptos" w:eastAsia="Aptos" w:hAnsi="Aptos"/>
+          <w:rFonts w:ascii="Calibri" w:cs="Calibri" w:eastAsia="Calibri" w:hAnsi="Calibri"/>
           <w:color w:val="55585E"/>
           <w:sz w:val="21"/>
           <w:szCs w:val="21"/>
@@ -72,7 +72,7 @@
       </w:pPr>
       <w:r>
         <w:rPr>
-          <w:rFonts w:ascii="Aptos" w:cs="Aptos" w:eastAsia="Aptos" w:hAnsi="Aptos"/>
+          <w:rFonts w:ascii="Calibri" w:cs="Calibri" w:eastAsia="Calibri" w:hAnsi="Calibri"/>
           <w:color w:val="61636A"/>
           <w:sz w:val="19"/>
           <w:szCs w:val="19"/>
@@ -90,7 +90,7 @@
       </w:r>
       <w:r>
         <w:rPr>
-          <w:rFonts w:ascii="Aptos" w:cs="Aptos" w:eastAsia="Aptos" w:hAnsi="Aptos"/>
+          <w:rFonts w:ascii="Calibri" w:cs="Calibri" w:eastAsia="Calibri" w:hAnsi="Calibri"/>
           <w:color w:val="61636A"/>
           <w:sz w:val="19"/>
           <w:szCs w:val="19"/>
@@ -108,7 +108,7 @@
       </w:r>
       <w:r>
         <w:rPr>
-          <w:rFonts w:ascii="Aptos" w:cs="Aptos" w:eastAsia="Aptos" w:hAnsi="Aptos"/>
+          <w:rFonts w:ascii="Calibri" w:cs="Calibri" w:eastAsia="Calibri" w:hAnsi="Calibri"/>
           <w:color w:val="61636A"/>
           <w:sz w:val="19"/>
           <w:szCs w:val="19"/>
@@ -126,7 +126,7 @@
       </w:r>
       <w:r>
         <w:rPr>
-          <w:rFonts w:ascii="Aptos" w:cs="Aptos" w:eastAsia="Aptos" w:hAnsi="Aptos"/>
+          <w:rFonts w:ascii="Calibri" w:cs="Calibri" w:eastAsia="Calibri" w:hAnsi="Calibri"/>
           <w:color w:val="61636A"/>
           <w:sz w:val="19"/>
           <w:szCs w:val="19"/>
@@ -144,7 +144,7 @@
       </w:pPr>
       <w:r>
         <w:rPr>
-          <w:rFonts w:ascii="Aptos" w:cs="Aptos" w:eastAsia="Aptos" w:hAnsi="Aptos"/>
+          <w:rFonts w:ascii="Calibri" w:cs="Calibri" w:eastAsia="Calibri" w:hAnsi="Calibri"/>
           <w:b/>
           <w:bCs/>
           <w:color w:val="393A3D"/>
@@ -160,7 +160,7 @@
       </w:pPr>
       <w:r>
         <w:rPr>
-          <w:rFonts w:ascii="Aptos" w:cs="Aptos" w:eastAsia="Aptos" w:hAnsi="Aptos"/>
+          <w:rFonts w:ascii="Calibri" w:cs="Calibri" w:eastAsia="Calibri" w:hAnsi="Calibri"/>
           <w:color w:val="55585E"/>
           <w:sz w:val="21"/>
           <w:szCs w:val="21"/>
@@ -206,7 +206,7 @@
             </w:pPr>
             <w:r>
               <w:rPr>
-                <w:rFonts w:ascii="Aptos" w:cs="Aptos" w:eastAsia="Aptos" w:hAnsi="Aptos"/>
+                <w:rFonts w:ascii="Calibri" w:cs="Calibri" w:eastAsia="Calibri" w:hAnsi="Calibri"/>
                 <w:b/>
                 <w:bCs/>
                 <w:color w:val="61636A"/>
@@ -233,7 +233,7 @@
             </w:pPr>
             <w:r>
               <w:rPr>
-                <w:rFonts w:ascii="Aptos" w:cs="Aptos" w:eastAsia="Aptos" w:hAnsi="Aptos"/>
+                <w:rFonts w:ascii="Calibri" w:cs="Calibri" w:eastAsia="Calibri" w:hAnsi="Calibri"/>
                 <w:b/>
                 <w:bCs/>
                 <w:color w:val="61636A"/>
@@ -260,7 +260,7 @@
             </w:pPr>
             <w:r>
               <w:rPr>
-                <w:rFonts w:ascii="Aptos" w:cs="Aptos" w:eastAsia="Aptos" w:hAnsi="Aptos"/>
+                <w:rFonts w:ascii="Calibri" w:cs="Calibri" w:eastAsia="Calibri" w:hAnsi="Calibri"/>
                 <w:b/>
                 <w:bCs/>
                 <w:color w:val="61636A"/>
@@ -287,7 +287,7 @@
             </w:pPr>
             <w:r>
               <w:rPr>
-                <w:rFonts w:ascii="Aptos" w:cs="Aptos" w:eastAsia="Aptos" w:hAnsi="Aptos"/>
+                <w:rFonts w:ascii="Calibri" w:cs="Calibri" w:eastAsia="Calibri" w:hAnsi="Calibri"/>
                 <w:b/>
                 <w:bCs/>
                 <w:color w:val="61636A"/>
@@ -363,7 +363,7 @@
             </w:pPr>
             <w:r>
               <w:rPr>
-                <w:rFonts w:ascii="Aptos" w:cs="Aptos" w:eastAsia="Aptos" w:hAnsi="Aptos"/>
+                <w:rFonts w:ascii="Calibri" w:cs="Calibri" w:eastAsia="Calibri" w:hAnsi="Calibri"/>
                 <w:color w:val="393A3D"/>
                 <w:sz w:val="21"/>
                 <w:szCs w:val="21"/>
@@ -387,7 +387,7 @@
             </w:pPr>
             <w:r>
               <w:rPr>
-                <w:rFonts w:ascii="Aptos" w:cs="Aptos" w:eastAsia="Aptos" w:hAnsi="Aptos"/>
+                <w:rFonts w:ascii="Calibri" w:cs="Calibri" w:eastAsia="Calibri" w:hAnsi="Calibri"/>
                 <w:color w:val="61636A"/>
                 <w:sz w:val="21"/>
                 <w:szCs w:val="21"/>
@@ -461,7 +461,7 @@
             </w:pPr>
             <w:r>
               <w:rPr>
-                <w:rFonts w:ascii="Aptos" w:cs="Aptos" w:eastAsia="Aptos" w:hAnsi="Aptos"/>
+                <w:rFonts w:ascii="Calibri" w:cs="Calibri" w:eastAsia="Calibri" w:hAnsi="Calibri"/>
                 <w:color w:val="393A3D"/>
                 <w:sz w:val="21"/>
                 <w:szCs w:val="21"/>
@@ -485,7 +485,7 @@
             </w:pPr>
             <w:r>
               <w:rPr>
-                <w:rFonts w:ascii="Aptos" w:cs="Aptos" w:eastAsia="Aptos" w:hAnsi="Aptos"/>
+                <w:rFonts w:ascii="Calibri" w:cs="Calibri" w:eastAsia="Calibri" w:hAnsi="Calibri"/>
                 <w:color w:val="61636A"/>
                 <w:sz w:val="21"/>
                 <w:szCs w:val="21"/>
@@ -559,7 +559,7 @@
             </w:pPr>
             <w:r>
               <w:rPr>
-                <w:rFonts w:ascii="Aptos" w:cs="Aptos" w:eastAsia="Aptos" w:hAnsi="Aptos"/>
+                <w:rFonts w:ascii="Calibri" w:cs="Calibri" w:eastAsia="Calibri" w:hAnsi="Calibri"/>
                 <w:color w:val="393A3D"/>
                 <w:sz w:val="21"/>
                 <w:szCs w:val="21"/>
@@ -583,7 +583,7 @@
             </w:pPr>
             <w:r>
               <w:rPr>
-                <w:rFonts w:ascii="Aptos" w:cs="Aptos" w:eastAsia="Aptos" w:hAnsi="Aptos"/>
+                <w:rFonts w:ascii="Calibri" w:cs="Calibri" w:eastAsia="Calibri" w:hAnsi="Calibri"/>
                 <w:color w:val="61636A"/>
                 <w:sz w:val="21"/>
                 <w:szCs w:val="21"/>
@@ -657,7 +657,7 @@
             </w:pPr>
             <w:r>
               <w:rPr>
-                <w:rFonts w:ascii="Aptos" w:cs="Aptos" w:eastAsia="Aptos" w:hAnsi="Aptos"/>
+                <w:rFonts w:ascii="Calibri" w:cs="Calibri" w:eastAsia="Calibri" w:hAnsi="Calibri"/>
                 <w:color w:val="393A3D"/>
                 <w:sz w:val="21"/>
                 <w:szCs w:val="21"/>
@@ -681,7 +681,7 @@
             </w:pPr>
             <w:r>
               <w:rPr>
-                <w:rFonts w:ascii="Aptos" w:cs="Aptos" w:eastAsia="Aptos" w:hAnsi="Aptos"/>
+                <w:rFonts w:ascii="Calibri" w:cs="Calibri" w:eastAsia="Calibri" w:hAnsi="Calibri"/>
                 <w:color w:val="393A3D"/>
                 <w:sz w:val="21"/>
                 <w:szCs w:val="21"/>
@@ -755,7 +755,7 @@
             </w:pPr>
             <w:r>
               <w:rPr>
-                <w:rFonts w:ascii="Aptos" w:cs="Aptos" w:eastAsia="Aptos" w:hAnsi="Aptos"/>
+                <w:rFonts w:ascii="Calibri" w:cs="Calibri" w:eastAsia="Calibri" w:hAnsi="Calibri"/>
                 <w:color w:val="393A3D"/>
                 <w:sz w:val="21"/>
                 <w:szCs w:val="21"/>
@@ -779,7 +779,7 @@
             </w:pPr>
             <w:r>
               <w:rPr>
-                <w:rFonts w:ascii="Aptos" w:cs="Aptos" w:eastAsia="Aptos" w:hAnsi="Aptos"/>
+                <w:rFonts w:ascii="Calibri" w:cs="Calibri" w:eastAsia="Calibri" w:hAnsi="Calibri"/>
                 <w:color w:val="393A3D"/>
                 <w:sz w:val="21"/>
                 <w:szCs w:val="21"/>
@@ -853,7 +853,7 @@
             </w:pPr>
             <w:r>
               <w:rPr>
-                <w:rFonts w:ascii="Aptos" w:cs="Aptos" w:eastAsia="Aptos" w:hAnsi="Aptos"/>
+                <w:rFonts w:ascii="Calibri" w:cs="Calibri" w:eastAsia="Calibri" w:hAnsi="Calibri"/>
                 <w:color w:val="393A3D"/>
                 <w:sz w:val="21"/>
                 <w:szCs w:val="21"/>
@@ -877,7 +877,7 @@
             </w:pPr>
             <w:r>
               <w:rPr>
-                <w:rFonts w:ascii="Aptos" w:cs="Aptos" w:eastAsia="Aptos" w:hAnsi="Aptos"/>
+                <w:rFonts w:ascii="Calibri" w:cs="Calibri" w:eastAsia="Calibri" w:hAnsi="Calibri"/>
                 <w:color w:val="61636A"/>
                 <w:sz w:val="21"/>
                 <w:szCs w:val="21"/>
@@ -951,7 +951,7 @@
             </w:pPr>
             <w:r>
               <w:rPr>
-                <w:rFonts w:ascii="Aptos" w:cs="Aptos" w:eastAsia="Aptos" w:hAnsi="Aptos"/>
+                <w:rFonts w:ascii="Calibri" w:cs="Calibri" w:eastAsia="Calibri" w:hAnsi="Calibri"/>
                 <w:color w:val="393A3D"/>
                 <w:sz w:val="21"/>
                 <w:szCs w:val="21"/>
@@ -975,7 +975,7 @@
             </w:pPr>
             <w:r>
               <w:rPr>
-                <w:rFonts w:ascii="Aptos" w:cs="Aptos" w:eastAsia="Aptos" w:hAnsi="Aptos"/>
+                <w:rFonts w:ascii="Calibri" w:cs="Calibri" w:eastAsia="Calibri" w:hAnsi="Calibri"/>
                 <w:color w:val="393A3D"/>
                 <w:sz w:val="21"/>
                 <w:szCs w:val="21"/>
@@ -1049,7 +1049,7 @@
             </w:pPr>
             <w:r>
               <w:rPr>
-                <w:rFonts w:ascii="Aptos" w:cs="Aptos" w:eastAsia="Aptos" w:hAnsi="Aptos"/>
+                <w:rFonts w:ascii="Calibri" w:cs="Calibri" w:eastAsia="Calibri" w:hAnsi="Calibri"/>
                 <w:color w:val="393A3D"/>
                 <w:sz w:val="21"/>
                 <w:szCs w:val="21"/>
@@ -1073,7 +1073,7 @@
             </w:pPr>
             <w:r>
               <w:rPr>
-                <w:rFonts w:ascii="Aptos" w:cs="Aptos" w:eastAsia="Aptos" w:hAnsi="Aptos"/>
+                <w:rFonts w:ascii="Calibri" w:cs="Calibri" w:eastAsia="Calibri" w:hAnsi="Calibri"/>
                 <w:color w:val="393A3D"/>
                 <w:sz w:val="21"/>
                 <w:szCs w:val="21"/>
@@ -1147,7 +1147,7 @@
             </w:pPr>
             <w:r>
               <w:rPr>
-                <w:rFonts w:ascii="Aptos" w:cs="Aptos" w:eastAsia="Aptos" w:hAnsi="Aptos"/>
+                <w:rFonts w:ascii="Calibri" w:cs="Calibri" w:eastAsia="Calibri" w:hAnsi="Calibri"/>
                 <w:color w:val="393A3D"/>
                 <w:sz w:val="21"/>
                 <w:szCs w:val="21"/>
@@ -1171,7 +1171,7 @@
             </w:pPr>
             <w:r>
               <w:rPr>
-                <w:rFonts w:ascii="Aptos" w:cs="Aptos" w:eastAsia="Aptos" w:hAnsi="Aptos"/>
+                <w:rFonts w:ascii="Calibri" w:cs="Calibri" w:eastAsia="Calibri" w:hAnsi="Calibri"/>
                 <w:color w:val="393A3D"/>
                 <w:sz w:val="21"/>
                 <w:szCs w:val="21"/>
@@ -1245,7 +1245,7 @@
             </w:pPr>
             <w:r>
               <w:rPr>
-                <w:rFonts w:ascii="Aptos" w:cs="Aptos" w:eastAsia="Aptos" w:hAnsi="Aptos"/>
+                <w:rFonts w:ascii="Calibri" w:cs="Calibri" w:eastAsia="Calibri" w:hAnsi="Calibri"/>
                 <w:color w:val="393A3D"/>
                 <w:sz w:val="21"/>
                 <w:szCs w:val="21"/>
@@ -1269,7 +1269,7 @@
             </w:pPr>
             <w:r>
               <w:rPr>
-                <w:rFonts w:ascii="Aptos" w:cs="Aptos" w:eastAsia="Aptos" w:hAnsi="Aptos"/>
+                <w:rFonts w:ascii="Calibri" w:cs="Calibri" w:eastAsia="Calibri" w:hAnsi="Calibri"/>
                 <w:color w:val="61636A"/>
                 <w:sz w:val="21"/>
                 <w:szCs w:val="21"/>
@@ -1343,7 +1343,7 @@
             </w:pPr>
             <w:r>
               <w:rPr>
-                <w:rFonts w:ascii="Aptos" w:cs="Aptos" w:eastAsia="Aptos" w:hAnsi="Aptos"/>
+                <w:rFonts w:ascii="Calibri" w:cs="Calibri" w:eastAsia="Calibri" w:hAnsi="Calibri"/>
                 <w:color w:val="393A3D"/>
                 <w:sz w:val="21"/>
                 <w:szCs w:val="21"/>
@@ -1367,7 +1367,7 @@
             </w:pPr>
             <w:r>
               <w:rPr>
-                <w:rFonts w:ascii="Aptos" w:cs="Aptos" w:eastAsia="Aptos" w:hAnsi="Aptos"/>
+                <w:rFonts w:ascii="Calibri" w:cs="Calibri" w:eastAsia="Calibri" w:hAnsi="Calibri"/>
                 <w:color w:val="61636A"/>
                 <w:sz w:val="21"/>
                 <w:szCs w:val="21"/>
@@ -1441,7 +1441,7 @@
             </w:pPr>
             <w:r>
               <w:rPr>
-                <w:rFonts w:ascii="Aptos" w:cs="Aptos" w:eastAsia="Aptos" w:hAnsi="Aptos"/>
+                <w:rFonts w:ascii="Calibri" w:cs="Calibri" w:eastAsia="Calibri" w:hAnsi="Calibri"/>
                 <w:color w:val="393A3D"/>
                 <w:sz w:val="21"/>
                 <w:szCs w:val="21"/>
@@ -1465,7 +1465,7 @@
             </w:pPr>
             <w:r>
               <w:rPr>
-                <w:rFonts w:ascii="Aptos" w:cs="Aptos" w:eastAsia="Aptos" w:hAnsi="Aptos"/>
+                <w:rFonts w:ascii="Calibri" w:cs="Calibri" w:eastAsia="Calibri" w:hAnsi="Calibri"/>
                 <w:color w:val="61636A"/>
                 <w:sz w:val="21"/>
                 <w:szCs w:val="21"/>
@@ -1488,7 +1488,7 @@
       </w:pPr>
       <w:r>
         <w:rPr>
-          <w:rFonts w:ascii="Aptos" w:cs="Aptos" w:eastAsia="Aptos" w:hAnsi="Aptos"/>
+          <w:rFonts w:ascii="Calibri" w:cs="Calibri" w:eastAsia="Calibri" w:hAnsi="Calibri"/>
           <w:b/>
           <w:bCs/>
           <w:color w:val="0B5ED1"/>
@@ -1504,7 +1504,7 @@
       </w:pPr>
       <w:r>
         <w:rPr>
-          <w:rFonts w:ascii="Aptos" w:cs="Aptos" w:eastAsia="Aptos" w:hAnsi="Aptos"/>
+          <w:rFonts w:ascii="Calibri" w:cs="Calibri" w:eastAsia="Calibri" w:hAnsi="Calibri"/>
           <w:color w:val="393A3D"/>
           <w:sz w:val="21"/>
           <w:szCs w:val="21"/>
@@ -1522,7 +1522,7 @@
       </w:r>
       <w:r>
         <w:rPr>
-          <w:rFonts w:ascii="Aptos" w:cs="Aptos" w:eastAsia="Aptos" w:hAnsi="Aptos"/>
+          <w:rFonts w:ascii="Calibri" w:cs="Calibri" w:eastAsia="Calibri" w:hAnsi="Calibri"/>
           <w:color w:val="393A3D"/>
           <w:sz w:val="21"/>
           <w:szCs w:val="21"/>
@@ -1540,7 +1540,7 @@
       </w:r>
       <w:r>
         <w:rPr>
-          <w:rFonts w:ascii="Aptos" w:cs="Aptos" w:eastAsia="Aptos" w:hAnsi="Aptos"/>
+          <w:rFonts w:ascii="Calibri" w:cs="Calibri" w:eastAsia="Calibri" w:hAnsi="Calibri"/>
           <w:color w:val="393A3D"/>
           <w:sz w:val="21"/>
           <w:szCs w:val="21"/>
@@ -1555,7 +1555,7 @@
       </w:pPr>
       <w:r>
         <w:rPr>
-          <w:rFonts w:ascii="Aptos" w:cs="Aptos" w:eastAsia="Aptos" w:hAnsi="Aptos"/>
+          <w:rFonts w:ascii="Calibri" w:cs="Calibri" w:eastAsia="Calibri" w:hAnsi="Calibri"/>
           <w:b/>
           <w:bCs/>
           <w:color w:val="0B5ED1"/>
@@ -1571,7 +1571,7 @@
       </w:pPr>
       <w:r>
         <w:rPr>
-          <w:rFonts w:ascii="Aptos" w:cs="Aptos" w:eastAsia="Aptos" w:hAnsi="Aptos"/>
+          <w:rFonts w:ascii="Calibri" w:cs="Calibri" w:eastAsia="Calibri" w:hAnsi="Calibri"/>
           <w:color w:val="393A3D"/>
           <w:sz w:val="21"/>
           <w:szCs w:val="21"/>
@@ -1586,7 +1586,7 @@
       </w:pPr>
       <w:r>
         <w:rPr>
-          <w:rFonts w:ascii="Aptos" w:cs="Aptos" w:eastAsia="Aptos" w:hAnsi="Aptos"/>
+          <w:rFonts w:ascii="Calibri" w:cs="Calibri" w:eastAsia="Calibri" w:hAnsi="Calibri"/>
           <w:b/>
           <w:bCs/>
           <w:color w:val="0B5ED1"/>
@@ -1602,7 +1602,7 @@
       </w:pPr>
       <w:r>
         <w:rPr>
-          <w:rFonts w:ascii="Aptos" w:cs="Aptos" w:eastAsia="Aptos" w:hAnsi="Aptos"/>
+          <w:rFonts w:ascii="Calibri" w:cs="Calibri" w:eastAsia="Calibri" w:hAnsi="Calibri"/>
           <w:color w:val="393A3D"/>
           <w:sz w:val="21"/>
           <w:szCs w:val="21"/>
@@ -1620,7 +1620,7 @@
       </w:r>
       <w:r>
         <w:rPr>
-          <w:rFonts w:ascii="Aptos" w:cs="Aptos" w:eastAsia="Aptos" w:hAnsi="Aptos"/>
+          <w:rFonts w:ascii="Calibri" w:cs="Calibri" w:eastAsia="Calibri" w:hAnsi="Calibri"/>
           <w:color w:val="393A3D"/>
           <w:sz w:val="21"/>
           <w:szCs w:val="21"/>
@@ -1638,7 +1638,7 @@
       </w:r>
       <w:r>
         <w:rPr>
-          <w:rFonts w:ascii="Aptos" w:cs="Aptos" w:eastAsia="Aptos" w:hAnsi="Aptos"/>
+          <w:rFonts w:ascii="Calibri" w:cs="Calibri" w:eastAsia="Calibri" w:hAnsi="Calibri"/>
           <w:color w:val="393A3D"/>
           <w:sz w:val="21"/>
           <w:szCs w:val="21"/>
@@ -1656,7 +1656,7 @@
       </w:r>
       <w:r>
         <w:rPr>
-          <w:rFonts w:ascii="Aptos" w:cs="Aptos" w:eastAsia="Aptos" w:hAnsi="Aptos"/>
+          <w:rFonts w:ascii="Calibri" w:cs="Calibri" w:eastAsia="Calibri" w:hAnsi="Calibri"/>
           <w:color w:val="393A3D"/>
           <w:sz w:val="21"/>
           <w:szCs w:val="21"/>
@@ -1670,7 +1670,7 @@
       </w:pPr>
       <w:r>
         <w:rPr>
-          <w:rFonts w:ascii="Aptos" w:cs="Aptos" w:eastAsia="Aptos" w:hAnsi="Aptos"/>
+          <w:rFonts w:ascii="Calibri" w:cs="Calibri" w:eastAsia="Calibri" w:hAnsi="Calibri"/>
           <w:color w:val="55585E"/>
           <w:sz w:val="21"/>
           <w:szCs w:val="21"/>
@@ -1688,7 +1688,7 @@
       </w:pPr>
       <w:r>
         <w:rPr>
-          <w:rFonts w:ascii="Aptos" w:cs="Aptos" w:eastAsia="Aptos" w:hAnsi="Aptos"/>
+          <w:rFonts w:ascii="Calibri" w:cs="Calibri" w:eastAsia="Calibri" w:hAnsi="Calibri"/>
           <w:b/>
           <w:bCs/>
           <w:color w:val="393A3D"/>
@@ -1704,7 +1704,7 @@
       </w:pPr>
       <w:r>
         <w:rPr>
-          <w:rFonts w:ascii="Aptos" w:cs="Aptos" w:eastAsia="Aptos" w:hAnsi="Aptos"/>
+          <w:rFonts w:ascii="Calibri" w:cs="Calibri" w:eastAsia="Calibri" w:hAnsi="Calibri"/>
           <w:color w:val="55585E"/>
           <w:sz w:val="21"/>
           <w:szCs w:val="21"/>
@@ -1749,7 +1749,7 @@
             </w:pPr>
             <w:r>
               <w:rPr>
-                <w:rFonts w:ascii="Aptos" w:cs="Aptos" w:eastAsia="Aptos" w:hAnsi="Aptos"/>
+                <w:rFonts w:ascii="Calibri" w:cs="Calibri" w:eastAsia="Calibri" w:hAnsi="Calibri"/>
                 <w:b/>
                 <w:bCs/>
                 <w:color w:val="61636A"/>
@@ -1776,7 +1776,7 @@
             </w:pPr>
             <w:r>
               <w:rPr>
-                <w:rFonts w:ascii="Aptos" w:cs="Aptos" w:eastAsia="Aptos" w:hAnsi="Aptos"/>
+                <w:rFonts w:ascii="Calibri" w:cs="Calibri" w:eastAsia="Calibri" w:hAnsi="Calibri"/>
                 <w:b/>
                 <w:bCs/>
                 <w:color w:val="61636A"/>
@@ -1803,7 +1803,7 @@
             </w:pPr>
             <w:r>
               <w:rPr>
-                <w:rFonts w:ascii="Aptos" w:cs="Aptos" w:eastAsia="Aptos" w:hAnsi="Aptos"/>
+                <w:rFonts w:ascii="Calibri" w:cs="Calibri" w:eastAsia="Calibri" w:hAnsi="Calibri"/>
                 <w:b/>
                 <w:bCs/>
                 <w:color w:val="61636A"/>
@@ -1831,7 +1831,7 @@
             </w:pPr>
             <w:r>
               <w:rPr>
-                <w:rFonts w:ascii="Aptos" w:cs="Aptos" w:eastAsia="Aptos" w:hAnsi="Aptos"/>
+                <w:rFonts w:ascii="Calibri" w:cs="Calibri" w:eastAsia="Calibri" w:hAnsi="Calibri"/>
                 <w:color w:val="393A3D"/>
                 <w:sz w:val="21"/>
                 <w:szCs w:val="21"/>
@@ -1879,7 +1879,7 @@
             </w:pPr>
             <w:r>
               <w:rPr>
-                <w:rFonts w:ascii="Aptos" w:cs="Aptos" w:eastAsia="Aptos" w:hAnsi="Aptos"/>
+                <w:rFonts w:ascii="Calibri" w:cs="Calibri" w:eastAsia="Calibri" w:hAnsi="Calibri"/>
                 <w:color w:val="393A3D"/>
                 <w:sz w:val="21"/>
                 <w:szCs w:val="21"/>
@@ -1905,7 +1905,7 @@
             </w:pPr>
             <w:r>
               <w:rPr>
-                <w:rFonts w:ascii="Aptos" w:cs="Aptos" w:eastAsia="Aptos" w:hAnsi="Aptos"/>
+                <w:rFonts w:ascii="Calibri" w:cs="Calibri" w:eastAsia="Calibri" w:hAnsi="Calibri"/>
                 <w:color w:val="393A3D"/>
                 <w:sz w:val="21"/>
                 <w:szCs w:val="21"/>
@@ -1953,7 +1953,7 @@
             </w:pPr>
             <w:r>
               <w:rPr>
-                <w:rFonts w:ascii="Aptos" w:cs="Aptos" w:eastAsia="Aptos" w:hAnsi="Aptos"/>
+                <w:rFonts w:ascii="Calibri" w:cs="Calibri" w:eastAsia="Calibri" w:hAnsi="Calibri"/>
                 <w:color w:val="393A3D"/>
                 <w:sz w:val="21"/>
                 <w:szCs w:val="21"/>
@@ -1979,7 +1979,7 @@
             </w:pPr>
             <w:r>
               <w:rPr>
-                <w:rFonts w:ascii="Aptos" w:cs="Aptos" w:eastAsia="Aptos" w:hAnsi="Aptos"/>
+                <w:rFonts w:ascii="Calibri" w:cs="Calibri" w:eastAsia="Calibri" w:hAnsi="Calibri"/>
                 <w:color w:val="393A3D"/>
                 <w:sz w:val="21"/>
                 <w:szCs w:val="21"/>
@@ -2027,7 +2027,7 @@
             </w:pPr>
             <w:r>
               <w:rPr>
-                <w:rFonts w:ascii="Aptos" w:cs="Aptos" w:eastAsia="Aptos" w:hAnsi="Aptos"/>
+                <w:rFonts w:ascii="Calibri" w:cs="Calibri" w:eastAsia="Calibri" w:hAnsi="Calibri"/>
                 <w:color w:val="393A3D"/>
                 <w:sz w:val="21"/>
                 <w:szCs w:val="21"/>
@@ -2053,7 +2053,7 @@
             </w:pPr>
             <w:r>
               <w:rPr>
-                <w:rFonts w:ascii="Aptos" w:cs="Aptos" w:eastAsia="Aptos" w:hAnsi="Aptos"/>
+                <w:rFonts w:ascii="Calibri" w:cs="Calibri" w:eastAsia="Calibri" w:hAnsi="Calibri"/>
                 <w:color w:val="393A3D"/>
                 <w:sz w:val="21"/>
                 <w:szCs w:val="21"/>
@@ -2101,7 +2101,7 @@
             </w:pPr>
             <w:r>
               <w:rPr>
-                <w:rFonts w:ascii="Aptos" w:cs="Aptos" w:eastAsia="Aptos" w:hAnsi="Aptos"/>
+                <w:rFonts w:ascii="Calibri" w:cs="Calibri" w:eastAsia="Calibri" w:hAnsi="Calibri"/>
                 <w:color w:val="393A3D"/>
                 <w:sz w:val="21"/>
                 <w:szCs w:val="21"/>
@@ -2124,7 +2124,7 @@
       </w:pPr>
       <w:r>
         <w:rPr>
-          <w:rFonts w:ascii="Aptos" w:cs="Aptos" w:eastAsia="Aptos" w:hAnsi="Aptos"/>
+          <w:rFonts w:ascii="Calibri" w:cs="Calibri" w:eastAsia="Calibri" w:hAnsi="Calibri"/>
           <w:b/>
           <w:bCs/>
           <w:color w:val="393A3D"/>
@@ -2174,7 +2174,7 @@
             </w:pPr>
             <w:r>
               <w:rPr>
-                <w:rFonts w:ascii="Aptos" w:cs="Aptos" w:eastAsia="Aptos" w:hAnsi="Aptos"/>
+                <w:rFonts w:ascii="Calibri" w:cs="Calibri" w:eastAsia="Calibri" w:hAnsi="Calibri"/>
                 <w:b/>
                 <w:bCs/>
                 <w:color w:val="61636A"/>
@@ -2201,7 +2201,7 @@
             </w:pPr>
             <w:r>
               <w:rPr>
-                <w:rFonts w:ascii="Aptos" w:cs="Aptos" w:eastAsia="Aptos" w:hAnsi="Aptos"/>
+                <w:rFonts w:ascii="Calibri" w:cs="Calibri" w:eastAsia="Calibri" w:hAnsi="Calibri"/>
                 <w:b/>
                 <w:bCs/>
                 <w:color w:val="61636A"/>
@@ -2228,7 +2228,7 @@
             </w:pPr>
             <w:r>
               <w:rPr>
-                <w:rFonts w:ascii="Aptos" w:cs="Aptos" w:eastAsia="Aptos" w:hAnsi="Aptos"/>
+                <w:rFonts w:ascii="Calibri" w:cs="Calibri" w:eastAsia="Calibri" w:hAnsi="Calibri"/>
                 <w:b/>
                 <w:bCs/>
                 <w:color w:val="61636A"/>
@@ -2255,7 +2255,7 @@
             </w:pPr>
             <w:r>
               <w:rPr>
-                <w:rFonts w:ascii="Aptos" w:cs="Aptos" w:eastAsia="Aptos" w:hAnsi="Aptos"/>
+                <w:rFonts w:ascii="Calibri" w:cs="Calibri" w:eastAsia="Calibri" w:hAnsi="Calibri"/>
                 <w:b/>
                 <w:bCs/>
                 <w:color w:val="61636A"/>
@@ -2282,7 +2282,7 @@
             </w:pPr>
             <w:r>
               <w:rPr>
-                <w:rFonts w:ascii="Aptos" w:cs="Aptos" w:eastAsia="Aptos" w:hAnsi="Aptos"/>
+                <w:rFonts w:ascii="Calibri" w:cs="Calibri" w:eastAsia="Calibri" w:hAnsi="Calibri"/>
                 <w:b/>
                 <w:bCs/>
                 <w:color w:val="61636A"/>
@@ -2309,7 +2309,7 @@
             </w:pPr>
             <w:r>
               <w:rPr>
-                <w:rFonts w:ascii="Aptos" w:cs="Aptos" w:eastAsia="Aptos" w:hAnsi="Aptos"/>
+                <w:rFonts w:ascii="Calibri" w:cs="Calibri" w:eastAsia="Calibri" w:hAnsi="Calibri"/>
                 <w:b/>
                 <w:bCs/>
                 <w:color w:val="61636A"/>
@@ -2361,7 +2361,7 @@
             </w:pPr>
             <w:r>
               <w:rPr>
-                <w:rFonts w:ascii="Aptos" w:cs="Aptos" w:eastAsia="Aptos" w:hAnsi="Aptos"/>
+                <w:rFonts w:ascii="Calibri" w:cs="Calibri" w:eastAsia="Calibri" w:hAnsi="Calibri"/>
                 <w:color w:val="393A3D"/>
                 <w:sz w:val="21"/>
                 <w:szCs w:val="21"/>
@@ -2385,7 +2385,7 @@
             </w:pPr>
             <w:r>
               <w:rPr>
-                <w:rFonts w:ascii="Aptos" w:cs="Aptos" w:eastAsia="Aptos" w:hAnsi="Aptos"/>
+                <w:rFonts w:ascii="Calibri" w:cs="Calibri" w:eastAsia="Calibri" w:hAnsi="Calibri"/>
                 <w:color w:val="393A3D"/>
                 <w:sz w:val="21"/>
                 <w:szCs w:val="21"/>
@@ -2457,7 +2457,7 @@
             </w:pPr>
             <w:r>
               <w:rPr>
-                <w:rFonts w:ascii="Aptos" w:cs="Aptos" w:eastAsia="Aptos" w:hAnsi="Aptos"/>
+                <w:rFonts w:ascii="Calibri" w:cs="Calibri" w:eastAsia="Calibri" w:hAnsi="Calibri"/>
                 <w:color w:val="393A3D"/>
                 <w:sz w:val="21"/>
                 <w:szCs w:val="21"/>
@@ -2507,7 +2507,7 @@
             </w:pPr>
             <w:r>
               <w:rPr>
-                <w:rFonts w:ascii="Aptos" w:cs="Aptos" w:eastAsia="Aptos" w:hAnsi="Aptos"/>
+                <w:rFonts w:ascii="Calibri" w:cs="Calibri" w:eastAsia="Calibri" w:hAnsi="Calibri"/>
                 <w:color w:val="393A3D"/>
                 <w:sz w:val="21"/>
                 <w:szCs w:val="21"/>
@@ -2531,7 +2531,7 @@
             </w:pPr>
             <w:r>
               <w:rPr>
-                <w:rFonts w:ascii="Aptos" w:cs="Aptos" w:eastAsia="Aptos" w:hAnsi="Aptos"/>
+                <w:rFonts w:ascii="Calibri" w:cs="Calibri" w:eastAsia="Calibri" w:hAnsi="Calibri"/>
                 <w:color w:val="393A3D"/>
                 <w:sz w:val="21"/>
                 <w:szCs w:val="21"/>
@@ -2603,7 +2603,7 @@
             </w:pPr>
             <w:r>
               <w:rPr>
-                <w:rFonts w:ascii="Aptos" w:cs="Aptos" w:eastAsia="Aptos" w:hAnsi="Aptos"/>
+                <w:rFonts w:ascii="Calibri" w:cs="Calibri" w:eastAsia="Calibri" w:hAnsi="Calibri"/>
                 <w:color w:val="393A3D"/>
                 <w:sz w:val="21"/>
                 <w:szCs w:val="21"/>
@@ -2653,7 +2653,7 @@
             </w:pPr>
             <w:r>
               <w:rPr>
-                <w:rFonts w:ascii="Aptos" w:cs="Aptos" w:eastAsia="Aptos" w:hAnsi="Aptos"/>
+                <w:rFonts w:ascii="Calibri" w:cs="Calibri" w:eastAsia="Calibri" w:hAnsi="Calibri"/>
                 <w:color w:val="393A3D"/>
                 <w:sz w:val="21"/>
                 <w:szCs w:val="21"/>
@@ -2677,7 +2677,7 @@
             </w:pPr>
             <w:r>
               <w:rPr>
-                <w:rFonts w:ascii="Aptos" w:cs="Aptos" w:eastAsia="Aptos" w:hAnsi="Aptos"/>
+                <w:rFonts w:ascii="Calibri" w:cs="Calibri" w:eastAsia="Calibri" w:hAnsi="Calibri"/>
                 <w:color w:val="393A3D"/>
                 <w:sz w:val="21"/>
                 <w:szCs w:val="21"/>
@@ -2749,7 +2749,7 @@
             </w:pPr>
             <w:r>
               <w:rPr>
-                <w:rFonts w:ascii="Aptos" w:cs="Aptos" w:eastAsia="Aptos" w:hAnsi="Aptos"/>
+                <w:rFonts w:ascii="Calibri" w:cs="Calibri" w:eastAsia="Calibri" w:hAnsi="Calibri"/>
                 <w:color w:val="393A3D"/>
                 <w:sz w:val="21"/>
                 <w:szCs w:val="21"/>
@@ -2799,7 +2799,7 @@
             </w:pPr>
             <w:r>
               <w:rPr>
-                <w:rFonts w:ascii="Aptos" w:cs="Aptos" w:eastAsia="Aptos" w:hAnsi="Aptos"/>
+                <w:rFonts w:ascii="Calibri" w:cs="Calibri" w:eastAsia="Calibri" w:hAnsi="Calibri"/>
                 <w:color w:val="393A3D"/>
                 <w:sz w:val="21"/>
                 <w:szCs w:val="21"/>
@@ -2823,7 +2823,7 @@
             </w:pPr>
             <w:r>
               <w:rPr>
-                <w:rFonts w:ascii="Aptos" w:cs="Aptos" w:eastAsia="Aptos" w:hAnsi="Aptos"/>
+                <w:rFonts w:ascii="Calibri" w:cs="Calibri" w:eastAsia="Calibri" w:hAnsi="Calibri"/>
                 <w:color w:val="393A3D"/>
                 <w:sz w:val="21"/>
                 <w:szCs w:val="21"/>
@@ -2895,7 +2895,7 @@
             </w:pPr>
             <w:r>
               <w:rPr>
-                <w:rFonts w:ascii="Aptos" w:cs="Aptos" w:eastAsia="Aptos" w:hAnsi="Aptos"/>
+                <w:rFonts w:ascii="Calibri" w:cs="Calibri" w:eastAsia="Calibri" w:hAnsi="Calibri"/>
                 <w:color w:val="393A3D"/>
                 <w:sz w:val="21"/>
                 <w:szCs w:val="21"/>
@@ -2945,7 +2945,7 @@
             </w:pPr>
             <w:r>
               <w:rPr>
-                <w:rFonts w:ascii="Aptos" w:cs="Aptos" w:eastAsia="Aptos" w:hAnsi="Aptos"/>
+                <w:rFonts w:ascii="Calibri" w:cs="Calibri" w:eastAsia="Calibri" w:hAnsi="Calibri"/>
                 <w:color w:val="393A3D"/>
                 <w:sz w:val="21"/>
                 <w:szCs w:val="21"/>
@@ -2969,7 +2969,7 @@
             </w:pPr>
             <w:r>
               <w:rPr>
-                <w:rFonts w:ascii="Aptos" w:cs="Aptos" w:eastAsia="Aptos" w:hAnsi="Aptos"/>
+                <w:rFonts w:ascii="Calibri" w:cs="Calibri" w:eastAsia="Calibri" w:hAnsi="Calibri"/>
                 <w:color w:val="393A3D"/>
                 <w:sz w:val="21"/>
                 <w:szCs w:val="21"/>
@@ -3041,7 +3041,7 @@
             </w:pPr>
             <w:r>
               <w:rPr>
-                <w:rFonts w:ascii="Aptos" w:cs="Aptos" w:eastAsia="Aptos" w:hAnsi="Aptos"/>
+                <w:rFonts w:ascii="Calibri" w:cs="Calibri" w:eastAsia="Calibri" w:hAnsi="Calibri"/>
                 <w:color w:val="393A3D"/>
                 <w:sz w:val="21"/>
                 <w:szCs w:val="21"/>
@@ -3091,7 +3091,7 @@
             </w:pPr>
             <w:r>
               <w:rPr>
-                <w:rFonts w:ascii="Aptos" w:cs="Aptos" w:eastAsia="Aptos" w:hAnsi="Aptos"/>
+                <w:rFonts w:ascii="Calibri" w:cs="Calibri" w:eastAsia="Calibri" w:hAnsi="Calibri"/>
                 <w:color w:val="393A3D"/>
                 <w:sz w:val="21"/>
                 <w:szCs w:val="21"/>
@@ -3115,7 +3115,7 @@
             </w:pPr>
             <w:r>
               <w:rPr>
-                <w:rFonts w:ascii="Aptos" w:cs="Aptos" w:eastAsia="Aptos" w:hAnsi="Aptos"/>
+                <w:rFonts w:ascii="Calibri" w:cs="Calibri" w:eastAsia="Calibri" w:hAnsi="Calibri"/>
                 <w:color w:val="393A3D"/>
                 <w:sz w:val="21"/>
                 <w:szCs w:val="21"/>
@@ -3187,7 +3187,7 @@
             </w:pPr>
             <w:r>
               <w:rPr>
-                <w:rFonts w:ascii="Aptos" w:cs="Aptos" w:eastAsia="Aptos" w:hAnsi="Aptos"/>
+                <w:rFonts w:ascii="Calibri" w:cs="Calibri" w:eastAsia="Calibri" w:hAnsi="Calibri"/>
                 <w:color w:val="393A3D"/>
                 <w:sz w:val="21"/>
                 <w:szCs w:val="21"/>
@@ -3237,7 +3237,7 @@
             </w:pPr>
             <w:r>
               <w:rPr>
-                <w:rFonts w:ascii="Aptos" w:cs="Aptos" w:eastAsia="Aptos" w:hAnsi="Aptos"/>
+                <w:rFonts w:ascii="Calibri" w:cs="Calibri" w:eastAsia="Calibri" w:hAnsi="Calibri"/>
                 <w:color w:val="393A3D"/>
                 <w:sz w:val="21"/>
                 <w:szCs w:val="21"/>
@@ -3261,7 +3261,7 @@
             </w:pPr>
             <w:r>
               <w:rPr>
-                <w:rFonts w:ascii="Aptos" w:cs="Aptos" w:eastAsia="Aptos" w:hAnsi="Aptos"/>
+                <w:rFonts w:ascii="Calibri" w:cs="Calibri" w:eastAsia="Calibri" w:hAnsi="Calibri"/>
                 <w:color w:val="393A3D"/>
                 <w:sz w:val="21"/>
                 <w:szCs w:val="21"/>
@@ -3333,7 +3333,7 @@
             </w:pPr>
             <w:r>
               <w:rPr>
-                <w:rFonts w:ascii="Aptos" w:cs="Aptos" w:eastAsia="Aptos" w:hAnsi="Aptos"/>
+                <w:rFonts w:ascii="Calibri" w:cs="Calibri" w:eastAsia="Calibri" w:hAnsi="Calibri"/>
                 <w:color w:val="393A3D"/>
                 <w:sz w:val="21"/>
                 <w:szCs w:val="21"/>
@@ -3360,7 +3360,7 @@
       </w:pPr>
       <w:r>
         <w:rPr>
-          <w:rFonts w:ascii="Aptos" w:cs="Aptos" w:eastAsia="Aptos" w:hAnsi="Aptos"/>
+          <w:rFonts w:ascii="Calibri" w:cs="Calibri" w:eastAsia="Calibri" w:hAnsi="Calibri"/>
           <w:b/>
           <w:bCs/>
           <w:color w:val="393A3D"/>
@@ -3371,7 +3371,7 @@
       </w:r>
       <w:r>
         <w:rPr>
-          <w:rFonts w:ascii="Aptos" w:cs="Aptos" w:eastAsia="Aptos" w:hAnsi="Aptos"/>
+          <w:rFonts w:ascii="Calibri" w:cs="Calibri" w:eastAsia="Calibri" w:hAnsi="Calibri"/>
           <w:color w:val="393A3D"/>
           <w:sz w:val="21"/>
           <w:szCs w:val="21"/>
@@ -3390,7 +3390,7 @@
       </w:pPr>
       <w:r>
         <w:rPr>
-          <w:rFonts w:ascii="Aptos" w:cs="Aptos" w:eastAsia="Aptos" w:hAnsi="Aptos"/>
+          <w:rFonts w:ascii="Calibri" w:cs="Calibri" w:eastAsia="Calibri" w:hAnsi="Calibri"/>
           <w:b/>
           <w:bCs/>
           <w:color w:val="393A3D"/>
@@ -3401,7 +3401,7 @@
       </w:r>
       <w:r>
         <w:rPr>
-          <w:rFonts w:ascii="Aptos" w:cs="Aptos" w:eastAsia="Aptos" w:hAnsi="Aptos"/>
+          <w:rFonts w:ascii="Calibri" w:cs="Calibri" w:eastAsia="Calibri" w:hAnsi="Calibri"/>
           <w:color w:val="393A3D"/>
           <w:sz w:val="21"/>
           <w:szCs w:val="21"/>
@@ -3419,7 +3419,7 @@
       </w:pPr>
       <w:r>
         <w:rPr>
-          <w:rFonts w:ascii="Aptos" w:cs="Aptos" w:eastAsia="Aptos" w:hAnsi="Aptos"/>
+          <w:rFonts w:ascii="Calibri" w:cs="Calibri" w:eastAsia="Calibri" w:hAnsi="Calibri"/>
           <w:b/>
           <w:bCs/>
           <w:color w:val="393A3D"/>
@@ -3466,7 +3466,7 @@
             </w:pPr>
             <w:r>
               <w:rPr>
-                <w:rFonts w:ascii="Aptos" w:cs="Aptos" w:eastAsia="Aptos" w:hAnsi="Aptos"/>
+                <w:rFonts w:ascii="Calibri" w:cs="Calibri" w:eastAsia="Calibri" w:hAnsi="Calibri"/>
                 <w:b/>
                 <w:bCs/>
                 <w:color w:val="61636A"/>
@@ -3493,7 +3493,7 @@
             </w:pPr>
             <w:r>
               <w:rPr>
-                <w:rFonts w:ascii="Aptos" w:cs="Aptos" w:eastAsia="Aptos" w:hAnsi="Aptos"/>
+                <w:rFonts w:ascii="Calibri" w:cs="Calibri" w:eastAsia="Calibri" w:hAnsi="Calibri"/>
                 <w:b/>
                 <w:bCs/>
                 <w:color w:val="61636A"/>
@@ -3520,7 +3520,7 @@
             </w:pPr>
             <w:r>
               <w:rPr>
-                <w:rFonts w:ascii="Aptos" w:cs="Aptos" w:eastAsia="Aptos" w:hAnsi="Aptos"/>
+                <w:rFonts w:ascii="Calibri" w:cs="Calibri" w:eastAsia="Calibri" w:hAnsi="Calibri"/>
                 <w:b/>
                 <w:bCs/>
                 <w:color w:val="61636A"/>
@@ -3596,7 +3596,7 @@
             </w:pPr>
             <w:r>
               <w:rPr>
-                <w:rFonts w:ascii="Aptos" w:cs="Aptos" w:eastAsia="Aptos" w:hAnsi="Aptos"/>
+                <w:rFonts w:ascii="Calibri" w:cs="Calibri" w:eastAsia="Calibri" w:hAnsi="Calibri"/>
                 <w:color w:val="393A3D"/>
                 <w:sz w:val="21"/>
                 <w:szCs w:val="21"/>
@@ -3670,7 +3670,7 @@
             </w:pPr>
             <w:r>
               <w:rPr>
-                <w:rFonts w:ascii="Aptos" w:cs="Aptos" w:eastAsia="Aptos" w:hAnsi="Aptos"/>
+                <w:rFonts w:ascii="Calibri" w:cs="Calibri" w:eastAsia="Calibri" w:hAnsi="Calibri"/>
                 <w:color w:val="393A3D"/>
                 <w:sz w:val="21"/>
                 <w:szCs w:val="21"/>
@@ -3744,7 +3744,7 @@
             </w:pPr>
             <w:r>
               <w:rPr>
-                <w:rFonts w:ascii="Aptos" w:cs="Aptos" w:eastAsia="Aptos" w:hAnsi="Aptos"/>
+                <w:rFonts w:ascii="Calibri" w:cs="Calibri" w:eastAsia="Calibri" w:hAnsi="Calibri"/>
                 <w:color w:val="393A3D"/>
                 <w:sz w:val="21"/>
                 <w:szCs w:val="21"/>
@@ -3770,7 +3770,7 @@
             </w:pPr>
             <w:r>
               <w:rPr>
-                <w:rFonts w:ascii="Aptos" w:cs="Aptos" w:eastAsia="Aptos" w:hAnsi="Aptos"/>
+                <w:rFonts w:ascii="Calibri" w:cs="Calibri" w:eastAsia="Calibri" w:hAnsi="Calibri"/>
                 <w:color w:val="61636A"/>
                 <w:sz w:val="21"/>
                 <w:szCs w:val="21"/>
@@ -3818,7 +3818,7 @@
             </w:pPr>
             <w:r>
               <w:rPr>
-                <w:rFonts w:ascii="Aptos" w:cs="Aptos" w:eastAsia="Aptos" w:hAnsi="Aptos"/>
+                <w:rFonts w:ascii="Calibri" w:cs="Calibri" w:eastAsia="Calibri" w:hAnsi="Calibri"/>
                 <w:color w:val="393A3D"/>
                 <w:sz w:val="21"/>
                 <w:szCs w:val="21"/>
@@ -3841,7 +3841,7 @@
       </w:pPr>
       <w:r>
         <w:rPr>
-          <w:rFonts w:ascii="Aptos" w:cs="Aptos" w:eastAsia="Aptos" w:hAnsi="Aptos"/>
+          <w:rFonts w:ascii="Calibri" w:cs="Calibri" w:eastAsia="Calibri" w:hAnsi="Calibri"/>
           <w:b/>
           <w:bCs/>
           <w:color w:val="393A3D"/>
@@ -3866,7 +3866,7 @@
       </w:r>
       <w:r>
         <w:rPr>
-          <w:rFonts w:ascii="Aptos" w:cs="Aptos" w:eastAsia="Aptos" w:hAnsi="Aptos"/>
+          <w:rFonts w:ascii="Calibri" w:cs="Calibri" w:eastAsia="Calibri" w:hAnsi="Calibri"/>
           <w:color w:val="393A3D"/>
           <w:sz w:val="21"/>
           <w:szCs w:val="21"/>
@@ -3889,7 +3889,7 @@
       </w:r>
       <w:r>
         <w:rPr>
-          <w:rFonts w:ascii="Aptos" w:cs="Aptos" w:eastAsia="Aptos" w:hAnsi="Aptos"/>
+          <w:rFonts w:ascii="Calibri" w:cs="Calibri" w:eastAsia="Calibri" w:hAnsi="Calibri"/>
           <w:color w:val="393A3D"/>
           <w:sz w:val="21"/>
           <w:szCs w:val="21"/>
@@ -3912,7 +3912,7 @@
       </w:r>
       <w:r>
         <w:rPr>
-          <w:rFonts w:ascii="Aptos" w:cs="Aptos" w:eastAsia="Aptos" w:hAnsi="Aptos"/>
+          <w:rFonts w:ascii="Calibri" w:cs="Calibri" w:eastAsia="Calibri" w:hAnsi="Calibri"/>
           <w:color w:val="393A3D"/>
           <w:sz w:val="21"/>
           <w:szCs w:val="21"/>
@@ -3930,7 +3930,7 @@
       </w:pPr>
       <w:r>
         <w:rPr>
-          <w:rFonts w:ascii="Aptos" w:cs="Aptos" w:eastAsia="Aptos" w:hAnsi="Aptos"/>
+          <w:rFonts w:ascii="Calibri" w:cs="Calibri" w:eastAsia="Calibri" w:hAnsi="Calibri"/>
           <w:color w:val="393A3D"/>
           <w:sz w:val="21"/>
           <w:szCs w:val="21"/>
@@ -3948,7 +3948,7 @@
       </w:pPr>
       <w:r>
         <w:rPr>
-          <w:rFonts w:ascii="Aptos" w:cs="Aptos" w:eastAsia="Aptos" w:hAnsi="Aptos"/>
+          <w:rFonts w:ascii="Calibri" w:cs="Calibri" w:eastAsia="Calibri" w:hAnsi="Calibri"/>
           <w:b/>
           <w:bCs/>
           <w:color w:val="393A3D"/>
@@ -3994,7 +3994,7 @@
             </w:pPr>
             <w:r>
               <w:rPr>
-                <w:rFonts w:ascii="Aptos" w:cs="Aptos" w:eastAsia="Aptos" w:hAnsi="Aptos"/>
+                <w:rFonts w:ascii="Calibri" w:cs="Calibri" w:eastAsia="Calibri" w:hAnsi="Calibri"/>
                 <w:b/>
                 <w:bCs/>
                 <w:color w:val="61636A"/>
@@ -4021,7 +4021,7 @@
             </w:pPr>
             <w:r>
               <w:rPr>
-                <w:rFonts w:ascii="Aptos" w:cs="Aptos" w:eastAsia="Aptos" w:hAnsi="Aptos"/>
+                <w:rFonts w:ascii="Calibri" w:cs="Calibri" w:eastAsia="Calibri" w:hAnsi="Calibri"/>
                 <w:b/>
                 <w:bCs/>
                 <w:color w:val="61636A"/>
@@ -4149,7 +4149,7 @@
             </w:pPr>
             <w:r>
               <w:rPr>
-                <w:rFonts w:ascii="Aptos" w:cs="Aptos" w:eastAsia="Aptos" w:hAnsi="Aptos"/>
+                <w:rFonts w:ascii="Calibri" w:cs="Calibri" w:eastAsia="Calibri" w:hAnsi="Calibri"/>
                 <w:color w:val="393A3D"/>
                 <w:sz w:val="21"/>
                 <w:szCs w:val="21"/>
@@ -4173,7 +4173,7 @@
             </w:pPr>
             <w:r>
               <w:rPr>
-                <w:rFonts w:ascii="Aptos" w:cs="Aptos" w:eastAsia="Aptos" w:hAnsi="Aptos"/>
+                <w:rFonts w:ascii="Calibri" w:cs="Calibri" w:eastAsia="Calibri" w:hAnsi="Calibri"/>
                 <w:color w:val="393A3D"/>
                 <w:sz w:val="21"/>
                 <w:szCs w:val="21"/>
@@ -4195,7 +4195,7 @@
       </w:pPr>
       <w:r>
         <w:rPr>
-          <w:rFonts w:ascii="Aptos" w:cs="Aptos" w:eastAsia="Aptos" w:hAnsi="Aptos"/>
+          <w:rFonts w:ascii="Calibri" w:cs="Calibri" w:eastAsia="Calibri" w:hAnsi="Calibri"/>
           <w:color w:val="55585E"/>
           <w:sz w:val="21"/>
           <w:szCs w:val="21"/>
@@ -4213,7 +4213,7 @@
       </w:pPr>
       <w:r>
         <w:rPr>
-          <w:rFonts w:ascii="Aptos" w:cs="Aptos" w:eastAsia="Aptos" w:hAnsi="Aptos"/>
+          <w:rFonts w:ascii="Calibri" w:cs="Calibri" w:eastAsia="Calibri" w:hAnsi="Calibri"/>
           <w:b/>
           <w:bCs/>
           <w:color w:val="393A3D"/>
@@ -4229,7 +4229,7 @@
       </w:pPr>
       <w:r>
         <w:rPr>
-          <w:rFonts w:ascii="Aptos" w:cs="Aptos" w:eastAsia="Aptos" w:hAnsi="Aptos"/>
+          <w:rFonts w:ascii="Calibri" w:cs="Calibri" w:eastAsia="Calibri" w:hAnsi="Calibri"/>
           <w:color w:val="55585E"/>
           <w:sz w:val="21"/>
           <w:szCs w:val="21"/>
@@ -4244,7 +4244,7 @@
       </w:pPr>
       <w:r>
         <w:rPr>
-          <w:rFonts w:ascii="Aptos" w:cs="Aptos" w:eastAsia="Aptos" w:hAnsi="Aptos"/>
+          <w:rFonts w:ascii="Calibri" w:cs="Calibri" w:eastAsia="Calibri" w:hAnsi="Calibri"/>
           <w:b/>
           <w:bCs/>
           <w:color w:val="0B5ED1"/>
@@ -4260,7 +4260,7 @@
       </w:pPr>
       <w:r>
         <w:rPr>
-          <w:rFonts w:ascii="Aptos" w:cs="Aptos" w:eastAsia="Aptos" w:hAnsi="Aptos"/>
+          <w:rFonts w:ascii="Calibri" w:cs="Calibri" w:eastAsia="Calibri" w:hAnsi="Calibri"/>
           <w:color w:val="393A3D"/>
           <w:sz w:val="21"/>
           <w:szCs w:val="21"/>
@@ -4278,7 +4278,7 @@
       </w:r>
       <w:r>
         <w:rPr>
-          <w:rFonts w:ascii="Aptos" w:cs="Aptos" w:eastAsia="Aptos" w:hAnsi="Aptos"/>
+          <w:rFonts w:ascii="Calibri" w:cs="Calibri" w:eastAsia="Calibri" w:hAnsi="Calibri"/>
           <w:color w:val="393A3D"/>
           <w:sz w:val="21"/>
           <w:szCs w:val="21"/>
@@ -4296,7 +4296,7 @@
       </w:r>
       <w:r>
         <w:rPr>
-          <w:rFonts w:ascii="Aptos" w:cs="Aptos" w:eastAsia="Aptos" w:hAnsi="Aptos"/>
+          <w:rFonts w:ascii="Calibri" w:cs="Calibri" w:eastAsia="Calibri" w:hAnsi="Calibri"/>
           <w:color w:val="393A3D"/>
           <w:sz w:val="21"/>
           <w:szCs w:val="21"/>
@@ -4305,7 +4305,7 @@
       </w:r>
       <w:r>
         <w:rPr>
-          <w:rFonts w:ascii="Aptos" w:cs="Aptos" w:eastAsia="Aptos" w:hAnsi="Aptos"/>
+          <w:rFonts w:ascii="Calibri" w:cs="Calibri" w:eastAsia="Calibri" w:hAnsi="Calibri"/>
           <w:i/>
           <w:iCs/>
           <w:color w:val="393A3D"/>
@@ -4316,7 +4316,7 @@
       </w:r>
       <w:r>
         <w:rPr>
-          <w:rFonts w:ascii="Aptos" w:cs="Aptos" w:eastAsia="Aptos" w:hAnsi="Aptos"/>
+          <w:rFonts w:ascii="Calibri" w:cs="Calibri" w:eastAsia="Calibri" w:hAnsi="Calibri"/>
           <w:color w:val="393A3D"/>
           <w:sz w:val="21"/>
           <w:szCs w:val="21"/>
@@ -4331,7 +4331,7 @@
       </w:pPr>
       <w:r>
         <w:rPr>
-          <w:rFonts w:ascii="Aptos" w:cs="Aptos" w:eastAsia="Aptos" w:hAnsi="Aptos"/>
+          <w:rFonts w:ascii="Calibri" w:cs="Calibri" w:eastAsia="Calibri" w:hAnsi="Calibri"/>
           <w:b/>
           <w:bCs/>
           <w:color w:val="0B5ED1"/>
@@ -4347,7 +4347,7 @@
       </w:pPr>
       <w:r>
         <w:rPr>
-          <w:rFonts w:ascii="Aptos" w:cs="Aptos" w:eastAsia="Aptos" w:hAnsi="Aptos"/>
+          <w:rFonts w:ascii="Calibri" w:cs="Calibri" w:eastAsia="Calibri" w:hAnsi="Calibri"/>
           <w:color w:val="393A3D"/>
           <w:sz w:val="21"/>
           <w:szCs w:val="21"/>
@@ -4365,7 +4365,7 @@
       </w:r>
       <w:r>
         <w:rPr>
-          <w:rFonts w:ascii="Aptos" w:cs="Aptos" w:eastAsia="Aptos" w:hAnsi="Aptos"/>
+          <w:rFonts w:ascii="Calibri" w:cs="Calibri" w:eastAsia="Calibri" w:hAnsi="Calibri"/>
           <w:color w:val="393A3D"/>
           <w:sz w:val="21"/>
           <w:szCs w:val="21"/>
@@ -4380,7 +4380,7 @@
       </w:pPr>
       <w:r>
         <w:rPr>
-          <w:rFonts w:ascii="Aptos" w:cs="Aptos" w:eastAsia="Aptos" w:hAnsi="Aptos"/>
+          <w:rFonts w:ascii="Calibri" w:cs="Calibri" w:eastAsia="Calibri" w:hAnsi="Calibri"/>
           <w:b/>
           <w:bCs/>
           <w:color w:val="0B5ED1"/>
@@ -4396,7 +4396,7 @@
       </w:pPr>
       <w:r>
         <w:rPr>
-          <w:rFonts w:ascii="Aptos" w:cs="Aptos" w:eastAsia="Aptos" w:hAnsi="Aptos"/>
+          <w:rFonts w:ascii="Calibri" w:cs="Calibri" w:eastAsia="Calibri" w:hAnsi="Calibri"/>
           <w:color w:val="393A3D"/>
           <w:sz w:val="21"/>
           <w:szCs w:val="21"/>
@@ -4411,7 +4411,7 @@
       </w:pPr>
       <w:r>
         <w:rPr>
-          <w:rFonts w:ascii="Aptos" w:cs="Aptos" w:eastAsia="Aptos" w:hAnsi="Aptos"/>
+          <w:rFonts w:ascii="Calibri" w:cs="Calibri" w:eastAsia="Calibri" w:hAnsi="Calibri"/>
           <w:b/>
           <w:bCs/>
           <w:color w:val="0B5ED1"/>
@@ -4427,7 +4427,7 @@
       </w:pPr>
       <w:r>
         <w:rPr>
-          <w:rFonts w:ascii="Aptos" w:cs="Aptos" w:eastAsia="Aptos" w:hAnsi="Aptos"/>
+          <w:rFonts w:ascii="Calibri" w:cs="Calibri" w:eastAsia="Calibri" w:hAnsi="Calibri"/>
           <w:color w:val="393A3D"/>
           <w:sz w:val="21"/>
           <w:szCs w:val="21"/>
@@ -4442,7 +4442,7 @@
       </w:pPr>
       <w:r>
         <w:rPr>
-          <w:rFonts w:ascii="Aptos" w:cs="Aptos" w:eastAsia="Aptos" w:hAnsi="Aptos"/>
+          <w:rFonts w:ascii="Calibri" w:cs="Calibri" w:eastAsia="Calibri" w:hAnsi="Calibri"/>
           <w:b/>
           <w:bCs/>
           <w:color w:val="0B5ED1"/>
@@ -4458,7 +4458,7 @@
       </w:pPr>
       <w:r>
         <w:rPr>
-          <w:rFonts w:ascii="Aptos" w:cs="Aptos" w:eastAsia="Aptos" w:hAnsi="Aptos"/>
+          <w:rFonts w:ascii="Calibri" w:cs="Calibri" w:eastAsia="Calibri" w:hAnsi="Calibri"/>
           <w:color w:val="393A3D"/>
           <w:sz w:val="21"/>
           <w:szCs w:val="21"/>
@@ -4476,7 +4476,7 @@
       </w:r>
       <w:r>
         <w:rPr>
-          <w:rFonts w:ascii="Aptos" w:cs="Aptos" w:eastAsia="Aptos" w:hAnsi="Aptos"/>
+          <w:rFonts w:ascii="Calibri" w:cs="Calibri" w:eastAsia="Calibri" w:hAnsi="Calibri"/>
           <w:color w:val="393A3D"/>
           <w:sz w:val="21"/>
           <w:szCs w:val="21"/>
@@ -4494,7 +4494,7 @@
       </w:r>
       <w:r>
         <w:rPr>
-          <w:rFonts w:ascii="Aptos" w:cs="Aptos" w:eastAsia="Aptos" w:hAnsi="Aptos"/>
+          <w:rFonts w:ascii="Calibri" w:cs="Calibri" w:eastAsia="Calibri" w:hAnsi="Calibri"/>
           <w:color w:val="393A3D"/>
           <w:sz w:val="21"/>
           <w:szCs w:val="21"/>
@@ -4512,7 +4512,7 @@
       </w:r>
       <w:r>
         <w:rPr>
-          <w:rFonts w:ascii="Aptos" w:cs="Aptos" w:eastAsia="Aptos" w:hAnsi="Aptos"/>
+          <w:rFonts w:ascii="Calibri" w:cs="Calibri" w:eastAsia="Calibri" w:hAnsi="Calibri"/>
           <w:color w:val="393A3D"/>
           <w:sz w:val="21"/>
           <w:szCs w:val="21"/>
@@ -4530,7 +4530,7 @@
       </w:r>
       <w:r>
         <w:rPr>
-          <w:rFonts w:ascii="Aptos" w:cs="Aptos" w:eastAsia="Aptos" w:hAnsi="Aptos"/>
+          <w:rFonts w:ascii="Calibri" w:cs="Calibri" w:eastAsia="Calibri" w:hAnsi="Calibri"/>
           <w:color w:val="393A3D"/>
           <w:sz w:val="21"/>
           <w:szCs w:val="21"/>
@@ -4548,7 +4548,7 @@
       </w:pPr>
       <w:r>
         <w:rPr>
-          <w:rFonts w:ascii="Aptos" w:cs="Aptos" w:eastAsia="Aptos" w:hAnsi="Aptos"/>
+          <w:rFonts w:ascii="Calibri" w:cs="Calibri" w:eastAsia="Calibri" w:hAnsi="Calibri"/>
           <w:b w:val="false"/>
           <w:bCs w:val="false"/>
           <w:color w:val="393A3D"/>
@@ -4559,7 +4559,7 @@
       </w:r>
       <w:r>
         <w:rPr>
-          <w:rFonts w:ascii="Aptos" w:cs="Aptos" w:eastAsia="Aptos" w:hAnsi="Aptos"/>
+          <w:rFonts w:ascii="Calibri" w:cs="Calibri" w:eastAsia="Calibri" w:hAnsi="Calibri"/>
           <w:b/>
           <w:bCs/>
           <w:color w:val="393A3D"/>
@@ -4570,7 +4570,7 @@
       </w:r>
       <w:r>
         <w:rPr>
-          <w:rFonts w:ascii="Aptos" w:cs="Aptos" w:eastAsia="Aptos" w:hAnsi="Aptos"/>
+          <w:rFonts w:ascii="Calibri" w:cs="Calibri" w:eastAsia="Calibri" w:hAnsi="Calibri"/>
           <w:color w:val="393A3D"/>
           <w:sz w:val="21"/>
           <w:szCs w:val="21"/>
@@ -4585,7 +4585,7 @@
       </w:pPr>
       <w:r>
         <w:rPr>
-          <w:rFonts w:ascii="Aptos" w:cs="Aptos" w:eastAsia="Aptos" w:hAnsi="Aptos"/>
+          <w:rFonts w:ascii="Calibri" w:cs="Calibri" w:eastAsia="Calibri" w:hAnsi="Calibri"/>
           <w:b/>
           <w:bCs/>
           <w:color w:val="0B5ED1"/>
@@ -4601,7 +4601,7 @@
       </w:pPr>
       <w:r>
         <w:rPr>
-          <w:rFonts w:ascii="Aptos" w:cs="Aptos" w:eastAsia="Aptos" w:hAnsi="Aptos"/>
+          <w:rFonts w:ascii="Calibri" w:cs="Calibri" w:eastAsia="Calibri" w:hAnsi="Calibri"/>
           <w:color w:val="393A3D"/>
           <w:sz w:val="21"/>
           <w:szCs w:val="21"/>
@@ -4619,7 +4619,7 @@
       </w:r>
       <w:r>
         <w:rPr>
-          <w:rFonts w:ascii="Aptos" w:cs="Aptos" w:eastAsia="Aptos" w:hAnsi="Aptos"/>
+          <w:rFonts w:ascii="Calibri" w:cs="Calibri" w:eastAsia="Calibri" w:hAnsi="Calibri"/>
           <w:color w:val="393A3D"/>
           <w:sz w:val="21"/>
           <w:szCs w:val="21"/>
@@ -4637,7 +4637,7 @@
       </w:r>
       <w:r>
         <w:rPr>
-          <w:rFonts w:ascii="Aptos" w:cs="Aptos" w:eastAsia="Aptos" w:hAnsi="Aptos"/>
+          <w:rFonts w:ascii="Calibri" w:cs="Calibri" w:eastAsia="Calibri" w:hAnsi="Calibri"/>
           <w:color w:val="393A3D"/>
           <w:sz w:val="21"/>
           <w:szCs w:val="21"/>
@@ -4652,7 +4652,7 @@
       </w:pPr>
       <w:r>
         <w:rPr>
-          <w:rFonts w:ascii="Aptos" w:cs="Aptos" w:eastAsia="Aptos" w:hAnsi="Aptos"/>
+          <w:rFonts w:ascii="Calibri" w:cs="Calibri" w:eastAsia="Calibri" w:hAnsi="Calibri"/>
           <w:b/>
           <w:bCs/>
           <w:color w:val="0B5ED1"/>
@@ -4668,7 +4668,7 @@
       </w:pPr>
       <w:r>
         <w:rPr>
-          <w:rFonts w:ascii="Aptos" w:cs="Aptos" w:eastAsia="Aptos" w:hAnsi="Aptos"/>
+          <w:rFonts w:ascii="Calibri" w:cs="Calibri" w:eastAsia="Calibri" w:hAnsi="Calibri"/>
           <w:color w:val="393A3D"/>
           <w:sz w:val="21"/>
           <w:szCs w:val="21"/>
@@ -4683,7 +4683,7 @@
       </w:pPr>
       <w:r>
         <w:rPr>
-          <w:rFonts w:ascii="Aptos" w:cs="Aptos" w:eastAsia="Aptos" w:hAnsi="Aptos"/>
+          <w:rFonts w:ascii="Calibri" w:cs="Calibri" w:eastAsia="Calibri" w:hAnsi="Calibri"/>
           <w:b/>
           <w:bCs/>
           <w:color w:val="0B5ED1"/>
@@ -4699,7 +4699,7 @@
       </w:pPr>
       <w:r>
         <w:rPr>
-          <w:rFonts w:ascii="Aptos" w:cs="Aptos" w:eastAsia="Aptos" w:hAnsi="Aptos"/>
+          <w:rFonts w:ascii="Calibri" w:cs="Calibri" w:eastAsia="Calibri" w:hAnsi="Calibri"/>
           <w:color w:val="55585E"/>
           <w:sz w:val="21"/>
           <w:szCs w:val="21"/>
@@ -4718,7 +4718,7 @@
       </w:pPr>
       <w:r>
         <w:rPr>
-          <w:rFonts w:ascii="Aptos" w:cs="Aptos" w:eastAsia="Aptos" w:hAnsi="Aptos"/>
+          <w:rFonts w:ascii="Calibri" w:cs="Calibri" w:eastAsia="Calibri" w:hAnsi="Calibri"/>
           <w:b/>
           <w:bCs/>
           <w:color w:val="393A3D"/>
@@ -4729,7 +4729,7 @@
       </w:r>
       <w:r>
         <w:rPr>
-          <w:rFonts w:ascii="Aptos" w:cs="Aptos" w:eastAsia="Aptos" w:hAnsi="Aptos"/>
+          <w:rFonts w:ascii="Calibri" w:cs="Calibri" w:eastAsia="Calibri" w:hAnsi="Calibri"/>
           <w:color w:val="393A3D"/>
           <w:sz w:val="21"/>
           <w:szCs w:val="21"/>
@@ -4748,7 +4748,7 @@
       </w:pPr>
       <w:r>
         <w:rPr>
-          <w:rFonts w:ascii="Aptos" w:cs="Aptos" w:eastAsia="Aptos" w:hAnsi="Aptos"/>
+          <w:rFonts w:ascii="Calibri" w:cs="Calibri" w:eastAsia="Calibri" w:hAnsi="Calibri"/>
           <w:b/>
           <w:bCs/>
           <w:color w:val="393A3D"/>
@@ -4768,7 +4768,7 @@
       </w:r>
       <w:r>
         <w:rPr>
-          <w:rFonts w:ascii="Aptos" w:cs="Aptos" w:eastAsia="Aptos" w:hAnsi="Aptos"/>
+          <w:rFonts w:ascii="Calibri" w:cs="Calibri" w:eastAsia="Calibri" w:hAnsi="Calibri"/>
           <w:color w:val="393A3D"/>
           <w:sz w:val="21"/>
           <w:szCs w:val="21"/>
@@ -4786,7 +4786,7 @@
       </w:pPr>
       <w:r>
         <w:rPr>
-          <w:rFonts w:ascii="Aptos" w:cs="Aptos" w:eastAsia="Aptos" w:hAnsi="Aptos"/>
+          <w:rFonts w:ascii="Calibri" w:cs="Calibri" w:eastAsia="Calibri" w:hAnsi="Calibri"/>
           <w:b/>
           <w:bCs/>
           <w:color w:val="393A3D"/>
@@ -4816,7 +4816,7 @@
       </w:r>
       <w:r>
         <w:rPr>
-          <w:rFonts w:ascii="Aptos" w:cs="Aptos" w:eastAsia="Aptos" w:hAnsi="Aptos"/>
+          <w:rFonts w:ascii="Calibri" w:cs="Calibri" w:eastAsia="Calibri" w:hAnsi="Calibri"/>
           <w:color w:val="393A3D"/>
           <w:sz w:val="21"/>
           <w:szCs w:val="21"/>
@@ -4844,7 +4844,7 @@
       </w:r>
       <w:r>
         <w:rPr>
-          <w:rFonts w:ascii="Aptos" w:cs="Aptos" w:eastAsia="Aptos" w:hAnsi="Aptos"/>
+          <w:rFonts w:ascii="Calibri" w:cs="Calibri" w:eastAsia="Calibri" w:hAnsi="Calibri"/>
           <w:color w:val="393A3D"/>
           <w:sz w:val="21"/>
           <w:szCs w:val="21"/>
@@ -4863,7 +4863,7 @@
       </w:pPr>
       <w:r>
         <w:rPr>
-          <w:rFonts w:ascii="Aptos" w:cs="Aptos" w:eastAsia="Aptos" w:hAnsi="Aptos"/>
+          <w:rFonts w:ascii="Calibri" w:cs="Calibri" w:eastAsia="Calibri" w:hAnsi="Calibri"/>
           <w:color w:val="393A3D"/>
           <w:sz w:val="21"/>
           <w:szCs w:val="21"/>
@@ -4881,7 +4881,7 @@
       </w:r>
       <w:r>
         <w:rPr>
-          <w:rFonts w:ascii="Aptos" w:cs="Aptos" w:eastAsia="Aptos" w:hAnsi="Aptos"/>
+          <w:rFonts w:ascii="Calibri" w:cs="Calibri" w:eastAsia="Calibri" w:hAnsi="Calibri"/>
           <w:color w:val="393A3D"/>
           <w:sz w:val="21"/>
           <w:szCs w:val="21"/>
@@ -4899,7 +4899,7 @@
       </w:r>
       <w:r>
         <w:rPr>
-          <w:rFonts w:ascii="Aptos" w:cs="Aptos" w:eastAsia="Aptos" w:hAnsi="Aptos"/>
+          <w:rFonts w:ascii="Calibri" w:cs="Calibri" w:eastAsia="Calibri" w:hAnsi="Calibri"/>
           <w:color w:val="393A3D"/>
           <w:sz w:val="21"/>
           <w:szCs w:val="21"/>
@@ -4916,7 +4916,7 @@
       </w:pPr>
       <w:r>
         <w:rPr>
-          <w:rFonts w:ascii="Aptos" w:cs="Aptos" w:eastAsia="Aptos" w:hAnsi="Aptos"/>
+          <w:rFonts w:ascii="Calibri" w:cs="Calibri" w:eastAsia="Calibri" w:hAnsi="Calibri"/>
           <w:color w:val="61636A"/>
           <w:sz w:val="18"/>
           <w:szCs w:val="18"/>
@@ -5112,7 +5112,7 @@
   <w:docDefaults>
     <w:rPrDefault>
       <w:rPr>
-        <w:rFonts w:ascii="Aptos" w:cs="Aptos" w:eastAsia="Aptos" w:hAnsi="Aptos"/>
+        <w:rFonts w:ascii="Calibri" w:cs="Calibri" w:eastAsia="Calibri" w:hAnsi="Calibri"/>
         <w:color w:val="393A3D"/>
         <w:sz w:val="21"/>
         <w:szCs w:val="21"/>

</xml_diff>